<commit_message>
Adapt letterhead and bank letter for Pakistan (SECP, NTN, CNIC, PKR)
Co-Authored-By: Claude Sonnet 5.5 <noreply@anthropic.com>
Claude-Session: https://claude.ai/code/session_01DFo29tTCUxjQWejnLXZyRx
</commit_message>
<xml_diff>
--- a/letterhead/ParaTech-Bank-Account-Letter.docx
+++ b/letterhead/ParaTech-Bank-Account-Letter.docx
@@ -25,7 +25,7 @@
           <w:sz w:val="22"/>
           <w:szCs w:val="22"/>
         </w:rPr>
-        <w:t xml:space="preserve">The Manager</w:t>
+        <w:t xml:space="preserve">The Branch Manager</w:t>
       </w:r>
     </w:p>
     <w:p>
@@ -51,7 +51,7 @@
           <w:sz w:val="22"/>
           <w:szCs w:val="22"/>
         </w:rPr>
-        <w:t xml:space="preserve">[Branch name and address]</w:t>
+        <w:t xml:space="preserve">[Branch name and address], Pakistan</w:t>
       </w:r>
     </w:p>
     <w:p>
@@ -66,7 +66,7 @@
           <w:sz w:val="22"/>
           <w:szCs w:val="22"/>
         </w:rPr>
-        <w:t xml:space="preserve">Subject: Request to open a business bank account – Paratech Solutions LLC</w:t>
+        <w:t xml:space="preserve">Subject: Request for opening of a Business Current Account – Paratech Solutions LLC</w:t>
       </w:r>
     </w:p>
     <w:p>
@@ -92,7 +92,7 @@
           <w:sz w:val="22"/>
           <w:szCs w:val="22"/>
         </w:rPr>
-        <w:t xml:space="preserve">We write to request the opening of a [current / savings] business account in the name of Paratech Solutions LLC (Registration No. [000000000]), an AI and digital solutions company providing digital design, software development, growth marketing and AI automation services.</w:t>
+        <w:t xml:space="preserve">We request you to open a Business Current Account (PKR) in the name of Paratech Solutions LLC. We are an AI and digital solutions company providing digital design, software development, growth marketing and AI automation services.</w:t>
       </w:r>
     </w:p>
     <w:p>
@@ -143,7 +143,7 @@
           <w:sz w:val="22"/>
           <w:szCs w:val="22"/>
         </w:rPr>
-        <w:t xml:space="preserve">Registration No.: [000000000]    EIN / Tax ID: [00-0000000]</w:t>
+        <w:t xml:space="preserve">Legal status: [Private Limited / SMC-Private Limited / Sole Proprietorship / AOP]</w:t>
       </w:r>
     </w:p>
     <w:p>
@@ -161,7 +161,7 @@
           <w:sz w:val="22"/>
           <w:szCs w:val="22"/>
         </w:rPr>
-        <w:t xml:space="preserve">Registered address: [Street address, City, State/Province, ZIP, Country]</w:t>
+        <w:t xml:space="preserve">SECP / Registration No.: [0000000]</w:t>
       </w:r>
     </w:p>
     <w:p>
@@ -179,7 +179,7 @@
           <w:sz w:val="22"/>
           <w:szCs w:val="22"/>
         </w:rPr>
-        <w:t xml:space="preserve">Nature of business: AI and digital solutions</w:t>
+        <w:t xml:space="preserve">NTN: [0000000-0]</w:t>
       </w:r>
     </w:p>
     <w:p>
@@ -197,35 +197,7 @@
           <w:sz w:val="22"/>
           <w:szCs w:val="22"/>
         </w:rPr>
-        <w:t xml:space="preserve">Expected monthly account activity: [amount / transactions]</w:t>
-      </w:r>
-    </w:p>
-    <w:p>
-      <w:pPr>
-        <w:spacing w:after="80" w:line="276"/>
-      </w:pPr>
-      <w:r>
-        <w:rPr>
-          <w:rFonts w:ascii="Calibri" w:cs="Calibri" w:eastAsia="Calibri" w:hAnsi="Calibri"/>
-          <w:sz w:val="22"/>
-          <w:szCs w:val="22"/>
-        </w:rPr>
-        <w:t xml:space="preserve"/>
-      </w:r>
-    </w:p>
-    <w:p>
-      <w:pPr>
-        <w:spacing w:after="80" w:line="276"/>
-      </w:pPr>
-      <w:r>
-        <w:rPr>
-          <w:rFonts w:ascii="Calibri" w:cs="Calibri" w:eastAsia="Calibri" w:hAnsi="Calibri"/>
-          <w:b/>
-          <w:bCs/>
-          <w:sz w:val="22"/>
-          <w:szCs w:val="22"/>
-        </w:rPr>
-        <w:t xml:space="preserve">Authorised signatory:</w:t>
+        <w:t xml:space="preserve">Registered address: [Office address, City], Pakistan</w:t>
       </w:r>
     </w:p>
     <w:p>
@@ -243,7 +215,25 @@
           <w:sz w:val="22"/>
           <w:szCs w:val="22"/>
         </w:rPr>
-        <w:t xml:space="preserve">[Full name], [Title – Owner / Director], authorised to operate the account [solely / jointly with …]</w:t>
+        <w:t xml:space="preserve">Nature of business: AI and digital solutions</w:t>
+      </w:r>
+    </w:p>
+    <w:p>
+      <w:pPr>
+        <w:pStyle w:val="ListParagraph"/>
+        <w:numPr>
+          <w:ilvl w:val="0"/>
+          <w:numId w:val="2"/>
+        </w:numPr>
+        <w:spacing w:after="80"/>
+      </w:pPr>
+      <w:r>
+        <w:rPr>
+          <w:rFonts w:ascii="Calibri" w:cs="Calibri" w:eastAsia="Calibri" w:hAnsi="Calibri"/>
+          <w:sz w:val="22"/>
+          <w:szCs w:val="22"/>
+        </w:rPr>
+        <w:t xml:space="preserve">Expected monthly turnover: Rs. [amount]</w:t>
       </w:r>
     </w:p>
     <w:p>
@@ -261,59 +251,7 @@
     </w:p>
     <w:p>
       <w:pPr>
-        <w:spacing w:after="140" w:line="276"/>
-      </w:pPr>
-      <w:r>
-        <w:rPr>
-          <w:rFonts w:ascii="Calibri" w:cs="Calibri" w:eastAsia="Calibri" w:hAnsi="Calibri"/>
-          <w:sz w:val="22"/>
-          <w:szCs w:val="22"/>
-        </w:rPr>
-        <w:t xml:space="preserve">We enclose the supporting documents required for account opening, including [certificate of registration, EIN/Tax ID confirmation, identification of the signatory and proof of address]. Please let us know if you need anything further.</w:t>
-      </w:r>
-    </w:p>
-    <w:p>
-      <w:pPr>
-        <w:spacing w:after="140" w:line="276"/>
-      </w:pPr>
-      <w:r>
-        <w:rPr>
-          <w:rFonts w:ascii="Calibri" w:cs="Calibri" w:eastAsia="Calibri" w:hAnsi="Calibri"/>
-          <w:sz w:val="22"/>
-          <w:szCs w:val="22"/>
-        </w:rPr>
-        <w:t xml:space="preserve">Thank you for your assistance. We look forward to establishing a banking relationship with you.</w:t>
-      </w:r>
-    </w:p>
-    <w:p>
-      <w:pPr>
-        <w:spacing w:after="500" w:line="276"/>
-      </w:pPr>
-      <w:r>
-        <w:rPr>
-          <w:rFonts w:ascii="Calibri" w:cs="Calibri" w:eastAsia="Calibri" w:hAnsi="Calibri"/>
-          <w:sz w:val="22"/>
-          <w:szCs w:val="22"/>
-        </w:rPr>
-        <w:t xml:space="preserve">Yours faithfully,</w:t>
-      </w:r>
-    </w:p>
-    <w:p>
-      <w:pPr>
-        <w:spacing w:after="0" w:line="276"/>
-      </w:pPr>
-      <w:r>
-        <w:rPr>
-          <w:rFonts w:ascii="Calibri" w:cs="Calibri" w:eastAsia="Calibri" w:hAnsi="Calibri"/>
-          <w:sz w:val="22"/>
-          <w:szCs w:val="22"/>
-        </w:rPr>
-        <w:t xml:space="preserve">______________________________</w:t>
-      </w:r>
-    </w:p>
-    <w:p>
-      <w:pPr>
-        <w:spacing w:after="0" w:line="276"/>
+        <w:spacing w:after="80" w:line="276"/>
       </w:pPr>
       <w:r>
         <w:rPr>
@@ -323,6 +261,104 @@
           <w:sz w:val="22"/>
           <w:szCs w:val="22"/>
         </w:rPr>
+        <w:t xml:space="preserve">Authorised signatory:</w:t>
+      </w:r>
+    </w:p>
+    <w:p>
+      <w:pPr>
+        <w:pStyle w:val="ListParagraph"/>
+        <w:numPr>
+          <w:ilvl w:val="0"/>
+          <w:numId w:val="2"/>
+        </w:numPr>
+        <w:spacing w:after="80"/>
+      </w:pPr>
+      <w:r>
+        <w:rPr>
+          <w:rFonts w:ascii="Calibri" w:cs="Calibri" w:eastAsia="Calibri" w:hAnsi="Calibri"/>
+          <w:sz w:val="22"/>
+          <w:szCs w:val="22"/>
+        </w:rPr>
+        <w:t xml:space="preserve">[Full name], [Director / Proprietor], CNIC No. [00000-0000000-0], authorised to operate the account [singly / jointly with …]</w:t>
+      </w:r>
+    </w:p>
+    <w:p>
+      <w:pPr>
+        <w:spacing w:after="80" w:line="276"/>
+      </w:pPr>
+      <w:r>
+        <w:rPr>
+          <w:rFonts w:ascii="Calibri" w:cs="Calibri" w:eastAsia="Calibri" w:hAnsi="Calibri"/>
+          <w:sz w:val="22"/>
+          <w:szCs w:val="22"/>
+        </w:rPr>
+        <w:t xml:space="preserve"/>
+      </w:r>
+    </w:p>
+    <w:p>
+      <w:pPr>
+        <w:spacing w:after="140" w:line="276"/>
+      </w:pPr>
+      <w:r>
+        <w:rPr>
+          <w:rFonts w:ascii="Calibri" w:cs="Calibri" w:eastAsia="Calibri" w:hAnsi="Calibri"/>
+          <w:sz w:val="22"/>
+          <w:szCs w:val="22"/>
+        </w:rPr>
+        <w:t xml:space="preserve">We enclose the following for your record: [certificate of incorporation / registration, NTN certificate, Memorandum &amp; Articles of Association, list of directors, board resolution for account opening, CNIC copies of signatories, proof of business address and specimen signature card]. Please advise if any further documents are required.</w:t>
+      </w:r>
+    </w:p>
+    <w:p>
+      <w:pPr>
+        <w:spacing w:after="140" w:line="276"/>
+      </w:pPr>
+      <w:r>
+        <w:rPr>
+          <w:rFonts w:ascii="Calibri" w:cs="Calibri" w:eastAsia="Calibri" w:hAnsi="Calibri"/>
+          <w:sz w:val="22"/>
+          <w:szCs w:val="22"/>
+        </w:rPr>
+        <w:t xml:space="preserve">Thank you for your assistance. We look forward to a long and mutually beneficial banking relationship.</w:t>
+      </w:r>
+    </w:p>
+    <w:p>
+      <w:pPr>
+        <w:spacing w:after="500" w:line="276"/>
+      </w:pPr>
+      <w:r>
+        <w:rPr>
+          <w:rFonts w:ascii="Calibri" w:cs="Calibri" w:eastAsia="Calibri" w:hAnsi="Calibri"/>
+          <w:sz w:val="22"/>
+          <w:szCs w:val="22"/>
+        </w:rPr>
+        <w:t xml:space="preserve">Yours faithfully,</w:t>
+      </w:r>
+    </w:p>
+    <w:p>
+      <w:pPr>
+        <w:spacing w:after="0" w:line="276"/>
+      </w:pPr>
+      <w:r>
+        <w:rPr>
+          <w:rFonts w:ascii="Calibri" w:cs="Calibri" w:eastAsia="Calibri" w:hAnsi="Calibri"/>
+          <w:sz w:val="22"/>
+          <w:szCs w:val="22"/>
+        </w:rPr>
+        <w:t xml:space="preserve">______________________________</w:t>
+      </w:r>
+    </w:p>
+    <w:p>
+      <w:pPr>
+        <w:spacing w:after="0" w:line="276"/>
+      </w:pPr>
+      <w:r>
+        <w:rPr>
+          <w:rFonts w:ascii="Calibri" w:cs="Calibri" w:eastAsia="Calibri" w:hAnsi="Calibri"/>
+          <w:b/>
+          <w:bCs/>
+          <w:sz w:val="22"/>
+          <w:szCs w:val="22"/>
+        </w:rPr>
         <w:t xml:space="preserve">[Full name]</w:t>
       </w:r>
     </w:p>
@@ -349,7 +385,7 @@
           <w:sz w:val="22"/>
           <w:szCs w:val="22"/>
         </w:rPr>
-        <w:t xml:space="preserve">Contact: contact@paratechsolutions.com  |  [+00 000 000 0000]</w:t>
+        <w:t xml:space="preserve">Contact: contact@paratechsolutions.com  |  [+92 000 0000000]</w:t>
       </w:r>
     </w:p>
     <w:sectPr>
@@ -495,7 +531,7 @@
               <w:sz w:val="16"/>
               <w:szCs w:val="16"/>
             </w:rPr>
-            <w:t xml:space="preserve">[City, State/Province, ZIP, Country]</w:t>
+            <w:t xml:space="preserve">[City], Pakistan</w:t>
           </w:r>
         </w:p>
       </w:tc>
@@ -544,7 +580,7 @@
               <w:sz w:val="16"/>
               <w:szCs w:val="16"/>
             </w:rPr>
-            <w:t xml:space="preserve">[+00 000 000 0000]</w:t>
+            <w:t xml:space="preserve">[+92 000 0000000]</w:t>
           </w:r>
         </w:p>
         <w:p>
@@ -647,7 +683,7 @@
               <w:sz w:val="13"/>
               <w:szCs w:val="13"/>
             </w:rPr>
-            <w:t xml:space="preserve">Paratech Solutions LLC  ·  Registration No. [000000000]  ·  EIN / Tax ID [00-0000000]</w:t>
+            <w:t xml:space="preserve">Paratech Solutions LLC  ·  SECP Reg. No. [0000000]  ·  NTN [0000000-0]</w:t>
           </w:r>
         </w:p>
       </w:tc>

</xml_diff>